<commit_message>
Rigenera il documento Word delle note di rilascio (versione 1.10)
Co-Authored-By: Claude Sonnet 5 <noreply@anthropic.com>
Claude-Session: https://claude.ai/code/session_01XMS8oqmsSH49iARPDCF5LD
</commit_message>
<xml_diff>
--- a/coordinamento-commesse/Note_di_Rilascio_Coordinamento_Commesse.docx
+++ b/coordinamento-commesse/Note_di_Rilascio_Coordinamento_Commesse.docx
@@ -32,7 +32,7 @@
           <w:i/>
           <w:iCs/>
         </w:rPr>
-        <w:t xml:space="preserve">Versione attuale: 1.9 — aggiornato al 29 ottobre 2026</w:t>
+        <w:t xml:space="preserve">Versione attuale: 1.10 — aggiornato al 30 ottobre 2026</w:t>
       </w:r>
     </w:p>
     <w:p>
@@ -50,6 +50,114 @@
         </w:pBdr>
         <w:spacing w:after="240"/>
       </w:pPr>
+    </w:p>
+    <w:p>
+      <w:pPr>
+        <w:pStyle w:val="Heading2"/>
+        <w:spacing w:after="160" w:before="360"/>
+      </w:pPr>
+      <w:r>
+        <w:t xml:space="preserve">Correzione import Excel di Approvazioni Drawings (30 ottobre 2026)</w:t>
+      </w:r>
+    </w:p>
+    <w:p>
+      <w:pPr>
+        <w:pStyle w:val="ListParagraph"/>
+        <w:numPr>
+          <w:ilvl w:val="0"/>
+          <w:numId w:val="1"/>
+        </w:numPr>
+        <w:spacing w:after="120"/>
+      </w:pPr>
+      <w:r>
+        <w:rPr>
+          <w:b w:val="false"/>
+          <w:bCs w:val="false"/>
+        </w:rPr>
+        <w:t xml:space="preserve">Risolto il problema per cui il pulsante </w:t>
+      </w:r>
+      <w:r>
+        <w:rPr>
+          <w:b/>
+          <w:bCs/>
+        </w:rPr>
+        <w:t xml:space="preserve">"Importa da Excel"</w:t>
+      </w:r>
+      <w:r>
+        <w:rPr>
+          <w:b w:val="false"/>
+          <w:bCs w:val="false"/>
+        </w:rPr>
+        <w:t xml:space="preserve"> nella scheda Approvazioni Drawings non importava nulla con l’elenco deliverable reale (le intestazioni erano in una riga diversa da quella attesa e i nomi di colonna non corrispondevano).</w:t>
+      </w:r>
+    </w:p>
+    <w:p>
+      <w:pPr>
+        <w:pStyle w:val="ListParagraph"/>
+        <w:numPr>
+          <w:ilvl w:val="0"/>
+          <w:numId w:val="1"/>
+        </w:numPr>
+        <w:spacing w:after="120"/>
+      </w:pPr>
+      <w:r>
+        <w:rPr>
+          <w:b w:val="false"/>
+          <w:bCs w:val="false"/>
+        </w:rPr>
+        <w:t xml:space="preserve">L’import ora riconosce sia il template semplice sia il formato reale dell’Elenco Deliverable, cercando da solo la riga di intestazione.</w:t>
+      </w:r>
+    </w:p>
+    <w:p>
+      <w:pPr>
+        <w:pStyle w:val="ListParagraph"/>
+        <w:numPr>
+          <w:ilvl w:val="0"/>
+          <w:numId w:val="1"/>
+        </w:numPr>
+        <w:spacing w:after="120"/>
+      </w:pPr>
+      <w:r>
+        <w:rPr>
+          <w:b w:val="false"/>
+          <w:bCs w:val="false"/>
+        </w:rPr>
+        <w:t xml:space="preserve">Quando un elaborato non ha ancora un "Nome elaborato" assegnato, viene usato come titolo provvisorio il nome dell’ambiente/area/zona, così da non perdere elaborati ancora senza un file formale.</w:t>
+      </w:r>
+    </w:p>
+    <w:p>
+      <w:pPr>
+        <w:pStyle w:val="ListParagraph"/>
+        <w:numPr>
+          <w:ilvl w:val="0"/>
+          <w:numId w:val="1"/>
+        </w:numPr>
+        <w:spacing w:after="120"/>
+      </w:pPr>
+      <w:r>
+        <w:rPr>
+          <w:b w:val="false"/>
+          <w:bCs w:val="false"/>
+        </w:rPr>
+        <w:t xml:space="preserve">Lo stato della colonna "Status" (OK, temi minori, in approvazione, da rilevare, ecc.) viene convertito automaticamente nei 4 stati dell’app, mantenendo il testo originale in nota quando serve.</w:t>
+      </w:r>
+    </w:p>
+    <w:p>
+      <w:pPr>
+        <w:pStyle w:val="ListParagraph"/>
+        <w:numPr>
+          <w:ilvl w:val="0"/>
+          <w:numId w:val="1"/>
+        </w:numPr>
+        <w:spacing w:after="120"/>
+      </w:pPr>
+      <w:r>
+        <w:rPr>
+          <w:b w:val="false"/>
+          <w:bCs w:val="false"/>
+        </w:rPr>
+        <w:t xml:space="preserve">Livello, Area, Ambiente, PM e le annotazioni della maschera GILI vengono riportati in nota, così da non perdere il contesto di ogni riga importata.</w:t>
+      </w:r>
     </w:p>
     <w:p>
       <w:pPr>

</xml_diff>

<commit_message>
Aggiorna le note di rilascio con la vista aggregata per gruppo (v1.11)
Co-Authored-By: Claude Sonnet 5 <noreply@anthropic.com>
Claude-Session: https://claude.ai/code/session_01XMS8oqmsSH49iARPDCF5LD
</commit_message>
<xml_diff>
--- a/coordinamento-commesse/Note_di_Rilascio_Coordinamento_Commesse.docx
+++ b/coordinamento-commesse/Note_di_Rilascio_Coordinamento_Commesse.docx
@@ -66,7 +66,7 @@
           <w:sz w:val="22"/>
           <w:szCs w:val="22"/>
         </w:rPr>
-        <w:t xml:space="preserve">Versione attuale: 1.10</w:t>
+        <w:t xml:space="preserve">Versione attuale: 1.11</w:t>
       </w:r>
     </w:p>
     <w:p>
@@ -178,17 +178,17 @@
           <w:sz w:val="26"/>
           <w:szCs w:val="26"/>
         </w:rPr>
-        <w:t xml:space="preserve">Versione 1.10  </w:t>
-      </w:r>
-      <w:r>
-        <w:rPr>
-          <w:b/>
-          <w:bCs/>
-          <w:color w:val="1F3A4D"/>
-          <w:sz w:val="26"/>
-          <w:szCs w:val="26"/>
-        </w:rPr>
-        <w:t xml:space="preserve">Correzione import Excel di Approvazioni Drawings</w:t>
+        <w:t xml:space="preserve">Versione 1.11  </w:t>
+      </w:r>
+      <w:r>
+        <w:rPr>
+          <w:b/>
+          <w:bCs/>
+          <w:color w:val="1F3A4D"/>
+          <w:sz w:val="26"/>
+          <w:szCs w:val="26"/>
+        </w:rPr>
+        <w:t xml:space="preserve">Vista aggregata per gruppo di commesse</w:t>
       </w:r>
     </w:p>
     <w:p>
@@ -217,6 +217,137 @@
           <w:szCs w:val="18"/>
         </w:rPr>
         <w:t xml:space="preserve">VERSIONE ATTUALE</w:t>
+      </w:r>
+    </w:p>
+    <w:p>
+      <w:pPr>
+        <w:spacing w:after="90" w:before="60"/>
+      </w:pPr>
+      <w:r>
+        <w:rPr>
+          <w:b/>
+          <w:bCs/>
+          <w:caps/>
+          <w:color w:val="1F3A4D"/>
+          <w:sz w:val="20"/>
+          <w:szCs w:val="20"/>
+        </w:rPr>
+        <w:t xml:space="preserve">Novità e miglioramenti</w:t>
+      </w:r>
+    </w:p>
+    <w:p>
+      <w:pPr>
+        <w:pStyle w:val="ListParagraph"/>
+        <w:numPr>
+          <w:ilvl w:val="0"/>
+          <w:numId w:val="1"/>
+        </w:numPr>
+        <w:spacing w:after="110"/>
+      </w:pPr>
+      <w:r>
+        <w:rPr>
+          <w:color w:val="262626"/>
+          <w:sz w:val="22"/>
+          <w:szCs w:val="22"/>
+        </w:rPr>
+        <w:t xml:space="preserve">Nuovo campo "Gruppo progetto" nella scheda di ogni commessa (es. "RSW Roma"): commesse diverse che fanno parte dello stesso progetto (es. 2514RW e 2593RW) possono condividere lo stesso gruppo, pur restando commesse distinte con il proprio codice.</w:t>
+      </w:r>
+    </w:p>
+    <w:p>
+      <w:pPr>
+        <w:pStyle w:val="ListParagraph"/>
+        <w:numPr>
+          <w:ilvl w:val="0"/>
+          <w:numId w:val="1"/>
+        </w:numPr>
+        <w:spacing w:after="110"/>
+      </w:pPr>
+      <w:r>
+        <w:rPr>
+          <w:color w:val="262626"/>
+          <w:sz w:val="22"/>
+          <w:szCs w:val="22"/>
+        </w:rPr>
+        <w:t xml:space="preserve">Quando due o più commesse condividono un gruppo, nel menu a tendina in alto a sinistra compare una nuova opzione "‹gruppo› — tutte (N)": selezionandola si vedono in un’unica vista, per tutti i registri, i dati di tutte le commesse del gruppo insieme — ogni riga mostra una colonna "Commessa" per sapere a quale commessa appartiene.</w:t>
+      </w:r>
+    </w:p>
+    <w:p>
+      <w:pPr>
+        <w:pStyle w:val="ListParagraph"/>
+        <w:numPr>
+          <w:ilvl w:val="0"/>
+          <w:numId w:val="1"/>
+        </w:numPr>
+        <w:spacing w:after="110"/>
+      </w:pPr>
+      <w:r>
+        <w:rPr>
+          <w:color w:val="262626"/>
+          <w:sz w:val="22"/>
+          <w:szCs w:val="22"/>
+        </w:rPr>
+        <w:t xml:space="preserve">La vista aggregata è di sola lettura: per creare o modificare una riga serve tornare a selezionare una singola commessa dal menu.</w:t>
+      </w:r>
+    </w:p>
+    <w:p>
+      <w:pPr>
+        <w:pStyle w:val="ListParagraph"/>
+        <w:numPr>
+          <w:ilvl w:val="0"/>
+          <w:numId w:val="1"/>
+        </w:numPr>
+        <w:spacing w:after="110"/>
+      </w:pPr>
+      <w:r>
+        <w:rPr>
+          <w:color w:val="262626"/>
+          <w:sz w:val="22"/>
+          <w:szCs w:val="22"/>
+        </w:rPr>
+        <w:t xml:space="preserve">Il Cruscotto e la Dashboard Finanziaria restano legati a una singola commessa e mostrano un avviso quando è selezionata la vista di gruppo.</w:t>
+      </w:r>
+    </w:p>
+    <w:p>
+      <w:pPr>
+        <w:pBdr>
+          <w:bottom w:val="single" w:color="1F3A4D" w:sz="6"/>
+        </w:pBdr>
+        <w:spacing w:after="60" w:before="420"/>
+      </w:pPr>
+      <w:r>
+        <w:rPr>
+          <w:b/>
+          <w:bCs/>
+          <w:color w:val="C0332B"/>
+          <w:sz w:val="26"/>
+          <w:szCs w:val="26"/>
+        </w:rPr>
+        <w:t xml:space="preserve">Versione 1.10  </w:t>
+      </w:r>
+      <w:r>
+        <w:rPr>
+          <w:b/>
+          <w:bCs/>
+          <w:color w:val="1F3A4D"/>
+          <w:sz w:val="26"/>
+          <w:szCs w:val="26"/>
+        </w:rPr>
+        <w:t xml:space="preserve">Correzione import Excel di Approvazioni Drawings</w:t>
+      </w:r>
+    </w:p>
+    <w:p>
+      <w:pPr>
+        <w:spacing w:after="160"/>
+      </w:pPr>
+      <w:r>
+        <w:rPr>
+          <w:i/>
+          <w:iCs/>
+          <w:color w:val="666666"/>
+          <w:sz w:val="20"/>
+          <w:szCs w:val="20"/>
+        </w:rPr>
+        <w:t xml:space="preserve">30 ottobre 2026</w:t>
       </w:r>
     </w:p>
     <w:p>

</xml_diff>

<commit_message>
Aggiunge import Excel del Registro Criticità PM (v1.12)
Nuovo pulsante "Importa da Excel" nella scheda Registro Criticità,
sullo stesso modello di Decisioni e Approvazioni Drawings: riconosce
la riga di intestazione reale del Registro Criticità PM di GILI
(anche con righe di titolo/legenda sopra) e assegna ogni riga al
Work Package corretto in base alla colonna PM (PM FOH/Corridoi/
Suite/Scala B -> WP1-WP4 della commessa 2514RW). Le righe con PM non
riconosciuto vengono saltate e segnalate con motivo, senza mai creare
commesse in automatico.

Co-Authored-By: Claude Sonnet 5 <noreply@anthropic.com>
Claude-Session: https://claude.ai/code/session_01XMS8oqmsSH49iARPDCF5LD
</commit_message>
<xml_diff>
--- a/coordinamento-commesse/Note_di_Rilascio_Coordinamento_Commesse.docx
+++ b/coordinamento-commesse/Note_di_Rilascio_Coordinamento_Commesse.docx
@@ -66,7 +66,7 @@
           <w:sz w:val="22"/>
           <w:szCs w:val="22"/>
         </w:rPr>
-        <w:t xml:space="preserve">Versione attuale: 1.11</w:t>
+        <w:t xml:space="preserve">Versione attuale: 1.12</w:t>
       </w:r>
     </w:p>
     <w:p>
@@ -178,17 +178,17 @@
           <w:sz w:val="26"/>
           <w:szCs w:val="26"/>
         </w:rPr>
-        <w:t xml:space="preserve">Versione 1.11  </w:t>
-      </w:r>
-      <w:r>
-        <w:rPr>
-          <w:b/>
-          <w:bCs/>
-          <w:color w:val="1F3A4D"/>
-          <w:sz w:val="26"/>
-          <w:szCs w:val="26"/>
-        </w:rPr>
-        <w:t xml:space="preserve">Vista aggregata per gruppo di commesse</w:t>
+        <w:t xml:space="preserve">Versione 1.12  </w:t>
+      </w:r>
+      <w:r>
+        <w:rPr>
+          <w:b/>
+          <w:bCs/>
+          <w:color w:val="1F3A4D"/>
+          <w:sz w:val="26"/>
+          <w:szCs w:val="26"/>
+        </w:rPr>
+        <w:t xml:space="preserve">Import Excel del Registro Criticità PM</w:t>
       </w:r>
     </w:p>
     <w:p>
@@ -217,6 +217,155 @@
           <w:szCs w:val="18"/>
         </w:rPr>
         <w:t xml:space="preserve">VERSIONE ATTUALE</w:t>
+      </w:r>
+    </w:p>
+    <w:p>
+      <w:pPr>
+        <w:spacing w:after="90" w:before="60"/>
+      </w:pPr>
+      <w:r>
+        <w:rPr>
+          <w:b/>
+          <w:bCs/>
+          <w:caps/>
+          <w:color w:val="1F3A4D"/>
+          <w:sz w:val="20"/>
+          <w:szCs w:val="20"/>
+        </w:rPr>
+        <w:t xml:space="preserve">Novità e miglioramenti</w:t>
+      </w:r>
+    </w:p>
+    <w:p>
+      <w:pPr>
+        <w:pStyle w:val="ListParagraph"/>
+        <w:numPr>
+          <w:ilvl w:val="0"/>
+          <w:numId w:val="1"/>
+        </w:numPr>
+        <w:spacing w:after="110"/>
+      </w:pPr>
+      <w:r>
+        <w:rPr>
+          <w:color w:val="262626"/>
+          <w:sz w:val="22"/>
+          <w:szCs w:val="22"/>
+        </w:rPr>
+        <w:t xml:space="preserve">Nuovo pulsante "Importa da Excel" nella scheda Registro Criticità, sullo stesso modello già disponibile per Decisioni e Approvazioni Drawings: permette di caricare direttamente il Registro Criticità aggiornato dai PM di GILI, senza doverlo ricopiare a mano.</w:t>
+      </w:r>
+    </w:p>
+    <w:p>
+      <w:pPr>
+        <w:pStyle w:val="ListParagraph"/>
+        <w:numPr>
+          <w:ilvl w:val="0"/>
+          <w:numId w:val="1"/>
+        </w:numPr>
+        <w:spacing w:after="110"/>
+      </w:pPr>
+      <w:r>
+        <w:rPr>
+          <w:color w:val="262626"/>
+          <w:sz w:val="22"/>
+          <w:szCs w:val="22"/>
+        </w:rPr>
+        <w:t xml:space="preserve">L’importazione riconosce da sola la riga di intestazione reale del file (anche quando sopra ci sono righe di titolo o legenda) e i nomi di colonna usati dai PM: PM, Piano/Area, Tipo, Criticità, Cosa serve, Urgenza, Data limite, Impatto PL, Stato, Note dal DDC, Risposta dei PM.</w:t>
+      </w:r>
+    </w:p>
+    <w:p>
+      <w:pPr>
+        <w:pStyle w:val="ListParagraph"/>
+        <w:numPr>
+          <w:ilvl w:val="0"/>
+          <w:numId w:val="1"/>
+        </w:numPr>
+        <w:spacing w:after="110"/>
+      </w:pPr>
+      <w:r>
+        <w:rPr>
+          <w:color w:val="262626"/>
+          <w:sz w:val="22"/>
+          <w:szCs w:val="22"/>
+        </w:rPr>
+        <w:t xml:space="preserve">Ogni riga viene assegnata in automatico al Work Package corretto in base alla colonna "PM": PM FOH → WP1 FOH, PM Corridoi → WP2 CORRIDOI, PM Suite → WP3 SUITE, PM Scala B → WP4 SCALA B, tutti all’interno della commessa 2514RW — coerentemente con il fatto che FOH, Corridoi, Suite e Scala B sono i quattro Work Package della stessa commessa, e non commesse separate.</w:t>
+      </w:r>
+    </w:p>
+    <w:p>
+      <w:pPr>
+        <w:pStyle w:val="ListParagraph"/>
+        <w:numPr>
+          <w:ilvl w:val="0"/>
+          <w:numId w:val="1"/>
+        </w:numPr>
+        <w:spacing w:after="110"/>
+      </w:pPr>
+      <w:r>
+        <w:rPr>
+          <w:color w:val="262626"/>
+          <w:sz w:val="22"/>
+          <w:szCs w:val="22"/>
+        </w:rPr>
+        <w:t xml:space="preserve">Le righe con un valore nella colonna "PM" non riconosciuto (ad esempio relativo a una commessa non ancora presente in Coordinamento Commesse) vengono saltate e segnalate con il motivo esatto, così nessun dato viene perso o assegnato per errore: l’app non crea mai in automatico una nuova commessa.</w:t>
+      </w:r>
+    </w:p>
+    <w:p>
+      <w:pPr>
+        <w:pStyle w:val="ListParagraph"/>
+        <w:numPr>
+          <w:ilvl w:val="0"/>
+          <w:numId w:val="1"/>
+        </w:numPr>
+        <w:spacing w:after="110"/>
+      </w:pPr>
+      <w:r>
+        <w:rPr>
+          <w:color w:val="262626"/>
+          <w:sz w:val="22"/>
+          <w:szCs w:val="22"/>
+        </w:rPr>
+        <w:t xml:space="preserve">Piano/Area, Tipo di criticità, Note dal DDC e Risposta dei PM vengono riportati in nota sulla criticità creata, per mantenere la piena tracciabilità di ogni riga importata rispetto al file originale.</w:t>
+      </w:r>
+    </w:p>
+    <w:p>
+      <w:pPr>
+        <w:pBdr>
+          <w:bottom w:val="single" w:color="1F3A4D" w:sz="6"/>
+        </w:pBdr>
+        <w:spacing w:after="60" w:before="420"/>
+      </w:pPr>
+      <w:r>
+        <w:rPr>
+          <w:b/>
+          <w:bCs/>
+          <w:color w:val="C0332B"/>
+          <w:sz w:val="26"/>
+          <w:szCs w:val="26"/>
+        </w:rPr>
+        <w:t xml:space="preserve">Versione 1.11  </w:t>
+      </w:r>
+      <w:r>
+        <w:rPr>
+          <w:b/>
+          <w:bCs/>
+          <w:color w:val="1F3A4D"/>
+          <w:sz w:val="26"/>
+          <w:szCs w:val="26"/>
+        </w:rPr>
+        <w:t xml:space="preserve">Vista aggregata per gruppo di commesse</w:t>
+      </w:r>
+    </w:p>
+    <w:p>
+      <w:pPr>
+        <w:spacing w:after="160"/>
+      </w:pPr>
+      <w:r>
+        <w:rPr>
+          <w:i/>
+          <w:iCs/>
+          <w:color w:val="666666"/>
+          <w:sz w:val="20"/>
+          <w:szCs w:val="20"/>
+        </w:rPr>
+        <w:t xml:space="preserve">30 ottobre 2026</w:t>
       </w:r>
     </w:p>
     <w:p>

</xml_diff>

<commit_message>
Corregge il pannello Work Package in vista di gruppo, aggiunge profondità alla sidebar (v1.13)
Il pannello "Work package della commessa selezionata" nella scheda
Commesse seguiva solo il filtro commessa della sidebar: in vista
aggregata di gruppo (state.commessaId nullo) restava sempre vuoto,
anche selezionando una riga della tabella. Ora segue la riga
selezionata nella tabella stessa, mostrando il codice commessa nel
titolo, in entrambe le modalità.

Sidebar: aggiunta una sfumatura verso un tono più scuro e un'ombra sul
bordo destro, per dare più profondità visiva, coerente in tema chiaro
e scuro.

Co-Authored-By: Claude Sonnet 5 <noreply@anthropic.com>
Claude-Session: https://claude.ai/code/session_01XMS8oqmsSH49iARPDCF5LD
</commit_message>
<xml_diff>
--- a/coordinamento-commesse/Note_di_Rilascio_Coordinamento_Commesse.docx
+++ b/coordinamento-commesse/Note_di_Rilascio_Coordinamento_Commesse.docx
@@ -66,7 +66,7 @@
           <w:sz w:val="22"/>
           <w:szCs w:val="22"/>
         </w:rPr>
-        <w:t xml:space="preserve">Versione attuale: 1.12</w:t>
+        <w:t xml:space="preserve">Versione attuale: 1.13</w:t>
       </w:r>
     </w:p>
     <w:p>
@@ -178,17 +178,17 @@
           <w:sz w:val="26"/>
           <w:szCs w:val="26"/>
         </w:rPr>
-        <w:t xml:space="preserve">Versione 1.12  </w:t>
-      </w:r>
-      <w:r>
-        <w:rPr>
-          <w:b/>
-          <w:bCs/>
-          <w:color w:val="1F3A4D"/>
-          <w:sz w:val="26"/>
-          <w:szCs w:val="26"/>
-        </w:rPr>
-        <w:t xml:space="preserve">Import Excel del Registro Criticità PM</w:t>
+        <w:t xml:space="preserve">Versione 1.13  </w:t>
+      </w:r>
+      <w:r>
+        <w:rPr>
+          <w:b/>
+          <w:bCs/>
+          <w:color w:val="1F3A4D"/>
+          <w:sz w:val="26"/>
+          <w:szCs w:val="26"/>
+        </w:rPr>
+        <w:t xml:space="preserve">Correzione pannello Work Package, sidebar con più profondità</w:t>
       </w:r>
     </w:p>
     <w:p>
@@ -217,6 +217,119 @@
           <w:szCs w:val="18"/>
         </w:rPr>
         <w:t xml:space="preserve">VERSIONE ATTUALE</w:t>
+      </w:r>
+    </w:p>
+    <w:p>
+      <w:pPr>
+        <w:spacing w:after="90" w:before="60"/>
+      </w:pPr>
+      <w:r>
+        <w:rPr>
+          <w:b/>
+          <w:bCs/>
+          <w:caps/>
+          <w:color w:val="1F3A4D"/>
+          <w:sz w:val="20"/>
+          <w:szCs w:val="20"/>
+        </w:rPr>
+        <w:t xml:space="preserve">Novità e miglioramenti</w:t>
+      </w:r>
+    </w:p>
+    <w:p>
+      <w:pPr>
+        <w:pStyle w:val="ListParagraph"/>
+        <w:numPr>
+          <w:ilvl w:val="0"/>
+          <w:numId w:val="1"/>
+        </w:numPr>
+        <w:spacing w:after="110"/>
+      </w:pPr>
+      <w:r>
+        <w:rPr>
+          <w:color w:val="262626"/>
+          <w:sz w:val="22"/>
+          <w:szCs w:val="22"/>
+        </w:rPr>
+        <w:t xml:space="preserve">Corretto un problema per cui, con la vista aggregata di gruppo attiva (es. "RSW Roma — tutte"), il pannello "Work package della commessa selezionata" nella scheda Commesse restava vuoto anche selezionando una riga della tabella.</w:t>
+      </w:r>
+    </w:p>
+    <w:p>
+      <w:pPr>
+        <w:pStyle w:val="ListParagraph"/>
+        <w:numPr>
+          <w:ilvl w:val="0"/>
+          <w:numId w:val="1"/>
+        </w:numPr>
+        <w:spacing w:after="110"/>
+      </w:pPr>
+      <w:r>
+        <w:rPr>
+          <w:color w:val="262626"/>
+          <w:sz w:val="22"/>
+          <w:szCs w:val="22"/>
+        </w:rPr>
+        <w:t xml:space="preserve">Ora il pannello segue sempre la riga selezionata nell’elenco commesse, mostrando il codice della commessa scelta nel titolo ("Work package di 2514RW"), sia in vista singola commessa sia in vista aggregata di gruppo.</w:t>
+      </w:r>
+    </w:p>
+    <w:p>
+      <w:pPr>
+        <w:pStyle w:val="ListParagraph"/>
+        <w:numPr>
+          <w:ilvl w:val="0"/>
+          <w:numId w:val="1"/>
+        </w:numPr>
+        <w:spacing w:after="110"/>
+      </w:pPr>
+      <w:r>
+        <w:rPr>
+          <w:color w:val="262626"/>
+          <w:sz w:val="22"/>
+          <w:szCs w:val="22"/>
+        </w:rPr>
+        <w:t xml:space="preserve">La sidebar a sinistra ha ora una leggera profondità: una sfumatura verso un tono più scuro e un’ombra sul bordo, per staccarla meglio dal contenuto della pagina — invariata nella sostanza, solo nell’aspetto, e coerente sia nel tema chiaro sia in quello scuro.</w:t>
+      </w:r>
+    </w:p>
+    <w:p>
+      <w:pPr>
+        <w:pBdr>
+          <w:bottom w:val="single" w:color="1F3A4D" w:sz="6"/>
+        </w:pBdr>
+        <w:spacing w:after="60" w:before="420"/>
+      </w:pPr>
+      <w:r>
+        <w:rPr>
+          <w:b/>
+          <w:bCs/>
+          <w:color w:val="C0332B"/>
+          <w:sz w:val="26"/>
+          <w:szCs w:val="26"/>
+        </w:rPr>
+        <w:t xml:space="preserve">Versione 1.12  </w:t>
+      </w:r>
+      <w:r>
+        <w:rPr>
+          <w:b/>
+          <w:bCs/>
+          <w:color w:val="1F3A4D"/>
+          <w:sz w:val="26"/>
+          <w:szCs w:val="26"/>
+        </w:rPr>
+        <w:t xml:space="preserve">Import Excel del Registro Criticità PM</w:t>
+      </w:r>
+    </w:p>
+    <w:p>
+      <w:pPr>
+        <w:spacing w:after="160"/>
+      </w:pPr>
+      <w:r>
+        <w:rPr>
+          <w:i/>
+          <w:iCs/>
+          <w:color w:val="666666"/>
+          <w:sz w:val="20"/>
+          <w:szCs w:val="20"/>
+        </w:rPr>
+        <w:t xml:space="preserve">30 ottobre 2026</w:t>
       </w:r>
     </w:p>
     <w:p>

</xml_diff>

<commit_message>
Corregge il menu laterale che non restava fisso durante lo scroll (v1.15)
La regola .side dichiarava "position:sticky" ma la stessa regola
chiudeva con un secondo "position:relative" residuo, che sovrascriveva
il primo e annullava l'effetto. Rimossa la dichiarazione duplicata:
verificato con Playwright che la sidebar ora resta ancorata in alto
anche scorrendo una pagina più alta del viewport.

Co-Authored-By: Claude Sonnet 5 <noreply@anthropic.com>
Claude-Session: https://claude.ai/code/session_01XMS8oqmsSH49iARPDCF5LD
</commit_message>
<xml_diff>
--- a/coordinamento-commesse/Note_di_Rilascio_Coordinamento_Commesse.docx
+++ b/coordinamento-commesse/Note_di_Rilascio_Coordinamento_Commesse.docx
@@ -66,7 +66,7 @@
           <w:sz w:val="22"/>
           <w:szCs w:val="22"/>
         </w:rPr>
-        <w:t xml:space="preserve">Versione attuale: 1.14</w:t>
+        <w:t xml:space="preserve">Versione attuale: 1.15</w:t>
       </w:r>
     </w:p>
     <w:p>
@@ -178,17 +178,17 @@
           <w:sz w:val="26"/>
           <w:szCs w:val="26"/>
         </w:rPr>
-        <w:t xml:space="preserve">Versione 1.14  </w:t>
-      </w:r>
-      <w:r>
-        <w:rPr>
-          <w:b/>
-          <w:bCs/>
-          <w:color w:val="1F3A4D"/>
-          <w:sz w:val="26"/>
-          <w:szCs w:val="26"/>
-        </w:rPr>
-        <w:t xml:space="preserve">Righe modificabili nella vista aggregata di gruppo</w:t>
+        <w:t xml:space="preserve">Versione 1.15  </w:t>
+      </w:r>
+      <w:r>
+        <w:rPr>
+          <w:b/>
+          <w:bCs/>
+          <w:color w:val="1F3A4D"/>
+          <w:sz w:val="26"/>
+          <w:szCs w:val="26"/>
+        </w:rPr>
+        <w:t xml:space="preserve">Menu laterale fisso durante lo scorrimento</w:t>
       </w:r>
     </w:p>
     <w:p>
@@ -217,6 +217,83 @@
           <w:szCs w:val="18"/>
         </w:rPr>
         <w:t xml:space="preserve">VERSIONE ATTUALE</w:t>
+      </w:r>
+    </w:p>
+    <w:p>
+      <w:pPr>
+        <w:spacing w:after="90" w:before="60"/>
+      </w:pPr>
+      <w:r>
+        <w:rPr>
+          <w:b/>
+          <w:bCs/>
+          <w:caps/>
+          <w:color w:val="1F3A4D"/>
+          <w:sz w:val="20"/>
+          <w:szCs w:val="20"/>
+        </w:rPr>
+        <w:t xml:space="preserve">Novità e miglioramenti</w:t>
+      </w:r>
+    </w:p>
+    <w:p>
+      <w:pPr>
+        <w:pStyle w:val="ListParagraph"/>
+        <w:numPr>
+          <w:ilvl w:val="0"/>
+          <w:numId w:val="1"/>
+        </w:numPr>
+        <w:spacing w:after="110"/>
+      </w:pPr>
+      <w:r>
+        <w:rPr>
+          <w:color w:val="262626"/>
+          <w:sz w:val="22"/>
+          <w:szCs w:val="22"/>
+        </w:rPr>
+        <w:t xml:space="preserve">Corretto un refuso nel foglio di stile che annullava l'effetto "fisso" del menu a sinistra: scorrendo una pagina lunga (es. un elenco con molte righe), il menu ora resta sempre visibile e nella stessa posizione, invece di scorrere via insieme al contenuto.</w:t>
+      </w:r>
+    </w:p>
+    <w:p>
+      <w:pPr>
+        <w:pBdr>
+          <w:bottom w:val="single" w:color="1F3A4D" w:sz="6"/>
+        </w:pBdr>
+        <w:spacing w:after="60" w:before="420"/>
+      </w:pPr>
+      <w:r>
+        <w:rPr>
+          <w:b/>
+          <w:bCs/>
+          <w:color w:val="C0332B"/>
+          <w:sz w:val="26"/>
+          <w:szCs w:val="26"/>
+        </w:rPr>
+        <w:t xml:space="preserve">Versione 1.14  </w:t>
+      </w:r>
+      <w:r>
+        <w:rPr>
+          <w:b/>
+          <w:bCs/>
+          <w:color w:val="1F3A4D"/>
+          <w:sz w:val="26"/>
+          <w:szCs w:val="26"/>
+        </w:rPr>
+        <w:t xml:space="preserve">Righe modificabili nella vista aggregata di gruppo</w:t>
+      </w:r>
+    </w:p>
+    <w:p>
+      <w:pPr>
+        <w:spacing w:after="160"/>
+      </w:pPr>
+      <w:r>
+        <w:rPr>
+          <w:i/>
+          <w:iCs/>
+          <w:color w:val="666666"/>
+          <w:sz w:val="20"/>
+          <w:szCs w:val="20"/>
+        </w:rPr>
+        <w:t xml:space="preserve">30 ottobre 2026</w:t>
       </w:r>
     </w:p>
     <w:p>

</xml_diff>

<commit_message>
Maestranze: il campo Nome ora si sceglie dal Registro Stakeholder (v1.17)
Stesso pattern già usato per Controparte nei Contratti e Impresa in
Lavorazioni: menu a tendina alimentato dagli stakeholder attivi della
commessa, con opzione di fallback per un nome storico non più
presente nel registro, così da non perdere dati già inseriti.

Co-Authored-By: Claude Sonnet 5 <noreply@anthropic.com>
Claude-Session: https://claude.ai/code/session_01XMS8oqmsSH49iARPDCF5LD
</commit_message>
<xml_diff>
--- a/coordinamento-commesse/Note_di_Rilascio_Coordinamento_Commesse.docx
+++ b/coordinamento-commesse/Note_di_Rilascio_Coordinamento_Commesse.docx
@@ -66,7 +66,7 @@
           <w:sz w:val="22"/>
           <w:szCs w:val="22"/>
         </w:rPr>
-        <w:t xml:space="preserve">Versione attuale: 1.16</w:t>
+        <w:t xml:space="preserve">Versione attuale: 1.17</w:t>
       </w:r>
     </w:p>
     <w:p>
@@ -178,17 +178,17 @@
           <w:sz w:val="26"/>
           <w:szCs w:val="26"/>
         </w:rPr>
-        <w:t xml:space="preserve">Versione 1.16  </w:t>
-      </w:r>
-      <w:r>
-        <w:rPr>
-          <w:b/>
-          <w:bCs/>
-          <w:color w:val="1F3A4D"/>
-          <w:sz w:val="26"/>
-          <w:szCs w:val="26"/>
-        </w:rPr>
-        <w:t xml:space="preserve">Contratti: controparte dal Registro Stakeholder, collegamento a più voci di Capitolato</w:t>
+        <w:t xml:space="preserve">Versione 1.17  </w:t>
+      </w:r>
+      <w:r>
+        <w:rPr>
+          <w:b/>
+          <w:bCs/>
+          <w:color w:val="1F3A4D"/>
+          <w:sz w:val="26"/>
+          <w:szCs w:val="26"/>
+        </w:rPr>
+        <w:t xml:space="preserve">Maestranze: nome scelto dal Registro Stakeholder</w:t>
       </w:r>
     </w:p>
     <w:p>
@@ -217,6 +217,101 @@
           <w:szCs w:val="18"/>
         </w:rPr>
         <w:t xml:space="preserve">VERSIONE ATTUALE</w:t>
+      </w:r>
+    </w:p>
+    <w:p>
+      <w:pPr>
+        <w:spacing w:after="90" w:before="60"/>
+      </w:pPr>
+      <w:r>
+        <w:rPr>
+          <w:b/>
+          <w:bCs/>
+          <w:caps/>
+          <w:color w:val="1F3A4D"/>
+          <w:sz w:val="20"/>
+          <w:szCs w:val="20"/>
+        </w:rPr>
+        <w:t xml:space="preserve">Novità e miglioramenti</w:t>
+      </w:r>
+    </w:p>
+    <w:p>
+      <w:pPr>
+        <w:pStyle w:val="ListParagraph"/>
+        <w:numPr>
+          <w:ilvl w:val="0"/>
+          <w:numId w:val="1"/>
+        </w:numPr>
+        <w:spacing w:after="110"/>
+      </w:pPr>
+      <w:r>
+        <w:rPr>
+          <w:color w:val="262626"/>
+          <w:sz w:val="22"/>
+          <w:szCs w:val="22"/>
+        </w:rPr>
+        <w:t xml:space="preserve">Nella scheda Maestranze, il campo "Nome" è ora un menu a tendina che pesca dal Registro Stakeholder della commessa, invece di un testo libero — coerente con "Controparte" nei Contratti, "Impresa" in Lavorazioni e i fornitori collegati già presenti in questa stessa scheda.</w:t>
+      </w:r>
+    </w:p>
+    <w:p>
+      <w:pPr>
+        <w:pStyle w:val="ListParagraph"/>
+        <w:numPr>
+          <w:ilvl w:val="0"/>
+          <w:numId w:val="1"/>
+        </w:numPr>
+        <w:spacing w:after="110"/>
+      </w:pPr>
+      <w:r>
+        <w:rPr>
+          <w:color w:val="262626"/>
+          <w:sz w:val="22"/>
+          <w:szCs w:val="22"/>
+        </w:rPr>
+        <w:t xml:space="preserve">Una maestranza già registrata in precedenza con un nome non presente nel Registro Stakeholder resta visibile e selezionata com'era, segnalata con la dicitura "(non più nel Registro Stakeholder)": nessun dato storico viene perso passando al menu a tendina.</w:t>
+      </w:r>
+    </w:p>
+    <w:p>
+      <w:pPr>
+        <w:pBdr>
+          <w:bottom w:val="single" w:color="1F3A4D" w:sz="6"/>
+        </w:pBdr>
+        <w:spacing w:after="60" w:before="420"/>
+      </w:pPr>
+      <w:r>
+        <w:rPr>
+          <w:b/>
+          <w:bCs/>
+          <w:color w:val="C0332B"/>
+          <w:sz w:val="26"/>
+          <w:szCs w:val="26"/>
+        </w:rPr>
+        <w:t xml:space="preserve">Versione 1.16  </w:t>
+      </w:r>
+      <w:r>
+        <w:rPr>
+          <w:b/>
+          <w:bCs/>
+          <w:color w:val="1F3A4D"/>
+          <w:sz w:val="26"/>
+          <w:szCs w:val="26"/>
+        </w:rPr>
+        <w:t xml:space="preserve">Contratti: controparte dal Registro Stakeholder, collegamento a più voci di Capitolato</w:t>
+      </w:r>
+    </w:p>
+    <w:p>
+      <w:pPr>
+        <w:spacing w:after="160"/>
+      </w:pPr>
+      <w:r>
+        <w:rPr>
+          <w:i/>
+          <w:iCs/>
+          <w:color w:val="666666"/>
+          <w:sz w:val="20"/>
+          <w:szCs w:val="20"/>
+        </w:rPr>
+        <w:t xml:space="preserve">31 ottobre 2026</w:t>
       </w:r>
     </w:p>
     <w:p>

</xml_diff>

<commit_message>
Storico con dettaglio modifiche, Dashboard Finanziaria per fornitore (v1.18)
Approvazioni Drawings, Capitolato Requisiti e Registro Stakeholder non
usavano ancora diffFields nel loro PUT: lo storico mostrava solo
"modificata"/"aggiornata" senza dire cosa fosse cambiato, a differenza
di Criticità, Decisioni e Allert. Aggiunto un elenco TRACKED per
ciascuno e il calcolo del diff, coerente con gli altri registri.

Dashboard Finanziaria: nuova tabella "Contratti fornitori" con
l'elenco piatto di ogni contratto su tutte le commesse (fornitore,
stato, data stipula, valore, atti aggiuntivi già sommati), accanto al
riepilogo già esistente aggregato per commessa.

Co-Authored-By: Claude Sonnet 5 <noreply@anthropic.com>
Claude-Session: https://claude.ai/code/session_01XMS8oqmsSH49iARPDCF5LD
</commit_message>
<xml_diff>
--- a/coordinamento-commesse/Note_di_Rilascio_Coordinamento_Commesse.docx
+++ b/coordinamento-commesse/Note_di_Rilascio_Coordinamento_Commesse.docx
@@ -66,7 +66,7 @@
           <w:sz w:val="22"/>
           <w:szCs w:val="22"/>
         </w:rPr>
-        <w:t xml:space="preserve">Versione attuale: 1.17</w:t>
+        <w:t xml:space="preserve">Versione attuale: 1.18</w:t>
       </w:r>
     </w:p>
     <w:p>
@@ -178,17 +178,17 @@
           <w:sz w:val="26"/>
           <w:szCs w:val="26"/>
         </w:rPr>
-        <w:t xml:space="preserve">Versione 1.17  </w:t>
-      </w:r>
-      <w:r>
-        <w:rPr>
-          <w:b/>
-          <w:bCs/>
-          <w:color w:val="1F3A4D"/>
-          <w:sz w:val="26"/>
-          <w:szCs w:val="26"/>
-        </w:rPr>
-        <w:t xml:space="preserve">Maestranze: nome scelto dal Registro Stakeholder</w:t>
+        <w:t xml:space="preserve">Versione 1.18  </w:t>
+      </w:r>
+      <w:r>
+        <w:rPr>
+          <w:b/>
+          <w:bCs/>
+          <w:color w:val="1F3A4D"/>
+          <w:sz w:val="26"/>
+          <w:szCs w:val="26"/>
+        </w:rPr>
+        <w:t xml:space="preserve">Storico con dettaglio delle modifiche, Dashboard Finanziaria per fornitore</w:t>
       </w:r>
     </w:p>
     <w:p>
@@ -217,6 +217,101 @@
           <w:szCs w:val="18"/>
         </w:rPr>
         <w:t xml:space="preserve">VERSIONE ATTUALE</w:t>
+      </w:r>
+    </w:p>
+    <w:p>
+      <w:pPr>
+        <w:spacing w:after="90" w:before="60"/>
+      </w:pPr>
+      <w:r>
+        <w:rPr>
+          <w:b/>
+          <w:bCs/>
+          <w:caps/>
+          <w:color w:val="1F3A4D"/>
+          <w:sz w:val="20"/>
+          <w:szCs w:val="20"/>
+        </w:rPr>
+        <w:t xml:space="preserve">Novità e miglioramenti</w:t>
+      </w:r>
+    </w:p>
+    <w:p>
+      <w:pPr>
+        <w:pStyle w:val="ListParagraph"/>
+        <w:numPr>
+          <w:ilvl w:val="0"/>
+          <w:numId w:val="1"/>
+        </w:numPr>
+        <w:spacing w:after="110"/>
+      </w:pPr>
+      <w:r>
+        <w:rPr>
+          <w:color w:val="262626"/>
+          <w:sz w:val="22"/>
+          <w:szCs w:val="22"/>
+        </w:rPr>
+        <w:t xml:space="preserve">Lo storico di Approvazioni Drawings, Capitolato Requisiti e Registro Stakeholder mostra ora esattamente cosa è cambiato ad ogni modifica (es. "Stato: In attesa → Approvato"), come già avveniva per Criticità, Decisioni e Allert — prima si vedeva solo che una modifica era avvenuta, non il dettaglio.</w:t>
+      </w:r>
+    </w:p>
+    <w:p>
+      <w:pPr>
+        <w:pStyle w:val="ListParagraph"/>
+        <w:numPr>
+          <w:ilvl w:val="0"/>
+          <w:numId w:val="1"/>
+        </w:numPr>
+        <w:spacing w:after="110"/>
+      </w:pPr>
+      <w:r>
+        <w:rPr>
+          <w:color w:val="262626"/>
+          <w:sz w:val="22"/>
+          <w:szCs w:val="22"/>
+        </w:rPr>
+        <w:t xml:space="preserve">Dashboard Finanziaria: aggiunta una nuova tabella "Contratti fornitori" con ogni singolo contratto registrato, su tutte le commesse — fornitore, stato, data di stipula, valore e atti aggiuntivi già sommati — accanto al riepilogo già esistente per commessa.</w:t>
+      </w:r>
+    </w:p>
+    <w:p>
+      <w:pPr>
+        <w:pBdr>
+          <w:bottom w:val="single" w:color="1F3A4D" w:sz="6"/>
+        </w:pBdr>
+        <w:spacing w:after="60" w:before="420"/>
+      </w:pPr>
+      <w:r>
+        <w:rPr>
+          <w:b/>
+          <w:bCs/>
+          <w:color w:val="C0332B"/>
+          <w:sz w:val="26"/>
+          <w:szCs w:val="26"/>
+        </w:rPr>
+        <w:t xml:space="preserve">Versione 1.17  </w:t>
+      </w:r>
+      <w:r>
+        <w:rPr>
+          <w:b/>
+          <w:bCs/>
+          <w:color w:val="1F3A4D"/>
+          <w:sz w:val="26"/>
+          <w:szCs w:val="26"/>
+        </w:rPr>
+        <w:t xml:space="preserve">Maestranze: nome scelto dal Registro Stakeholder</w:t>
+      </w:r>
+    </w:p>
+    <w:p>
+      <w:pPr>
+        <w:spacing w:after="160"/>
+      </w:pPr>
+      <w:r>
+        <w:rPr>
+          <w:i/>
+          <w:iCs/>
+          <w:color w:val="666666"/>
+          <w:sz w:val="20"/>
+          <w:szCs w:val="20"/>
+        </w:rPr>
+        <w:t xml:space="preserve">31 ottobre 2026</w:t>
       </w:r>
     </w:p>
     <w:p>

</xml_diff>